<commit_message>
Use the deployed portfolio URL in documents
Co-Authored-By: Claude Opus 5.5 <noreply@anthropic.com>
</commit_message>
<xml_diff>
--- a/docs/경력기술서.docx
+++ b/docs/경력기술서.docx
@@ -1110,7 +1110,7 @@
       <w:r>
         <w:t xml:space="preserve">T10: </w:t>
       </w:r>
-      <w:hyperlink w:history="1" r:id="rIdbuzxdvjx0mja-qjphkc2a">
+      <w:hyperlink w:history="1" r:id="rIdfesh7rhxt1jq9kkk6xczv">
         <w:r>
           <w:rPr>
             <w:rStyle w:val="Hyperlink"/>
@@ -1131,7 +1131,7 @@
       <w:r>
         <w:t xml:space="preserve">T12: </w:t>
       </w:r>
-      <w:hyperlink w:history="1" r:id="rIdkkmymvbqjpmgby8e6gjkv">
+      <w:hyperlink w:history="1" r:id="rIdzbjjqsrkxnma2macvs90w">
         <w:r>
           <w:rPr>
             <w:rStyle w:val="Hyperlink"/>

</xml_diff>

<commit_message>
Retitle the story and shrink the cover name
Co-Authored-By: Claude Opus 5.5 <noreply@anthropic.com>
</commit_message>
<xml_diff>
--- a/docs/경력기술서.docx
+++ b/docs/경력기술서.docx
@@ -1110,7 +1110,7 @@
       <w:r>
         <w:t xml:space="preserve">T10: </w:t>
       </w:r>
-      <w:hyperlink w:history="1" r:id="rIdfesh7rhxt1jq9kkk6xczv">
+      <w:hyperlink w:history="1" r:id="rIdbt4winq9xna2mo71dyaup">
         <w:r>
           <w:rPr>
             <w:rStyle w:val="Hyperlink"/>
@@ -1131,7 +1131,7 @@
       <w:r>
         <w:t xml:space="preserve">T12: </w:t>
       </w:r>
-      <w:hyperlink w:history="1" r:id="rIdzbjjqsrkxnma2macvs90w">
+      <w:hyperlink w:history="1" r:id="rId-wloaetvv5jmymwkxfqp5">
         <w:r>
           <w:rPr>
             <w:rStyle w:val="Hyperlink"/>

</xml_diff>

<commit_message>
Widen the T11 period in the resume documents
Co-Authored-By: Claude Opus 5.5 <noreply@anthropic.com>
</commit_message>
<xml_diff>
--- a/docs/경력기술서.docx
+++ b/docs/경력기술서.docx
@@ -752,7 +752,7 @@
           </w:tcPr>
           <w:p>
             <w:r>
-              <w:t xml:space="preserve">T11 소설 (2026.10)</w:t>
+              <w:t xml:space="preserve">T11 소설 (2026.09 ~ 10)</w:t>
             </w:r>
           </w:p>
         </w:tc>
@@ -1110,7 +1110,7 @@
       <w:r>
         <w:t xml:space="preserve">T10: </w:t>
       </w:r>
-      <w:hyperlink w:history="1" r:id="rIdbt4winq9xna2mo71dyaup">
+      <w:hyperlink w:history="1" r:id="rIdf7orqemx7v9_kiqj4if9p">
         <w:r>
           <w:rPr>
             <w:rStyle w:val="Hyperlink"/>
@@ -1131,7 +1131,7 @@
       <w:r>
         <w:t xml:space="preserve">T12: </w:t>
       </w:r>
-      <w:hyperlink w:history="1" r:id="rId-wloaetvv5jmymwkxfqp5">
+      <w:hyperlink w:history="1" r:id="rIdhi8zsjk7eucnwmgusc6cm">
         <w:r>
           <w:rPr>
             <w:rStyle w:val="Hyperlink"/>

</xml_diff>